<commit_message>
Produktionskoordination-Stellenbeschreibung: Qualifikationen bestätigt (Ausbildungspunkt entfernt)
Alexander hat den Abschnitt "Erforderliche Qualifikationen" bestätigt,
den Punkt zur abgeschlossenen Ausbildung gestrichen (bereits durch die
übrigen Punkte abgedeckt).

Co-Authored-By: Claude Sonnet 5 <noreply@anthropic.com>
Claude-Session: https://claude.ai/code/session_01DYu9Jmx4EF5jDapuJDs8ut
</commit_message>
<xml_diff>
--- a/working/PRODUKTIONSKOORDINATION_Stellenbeschreibung_Arbeitsentwurf.docx
+++ b/working/PRODUKTIONSKOORDINATION_Stellenbeschreibung_Arbeitsentwurf.docx
@@ -330,23 +330,6 @@
           <w:rFonts w:ascii="Calibri" w:cs="Calibri" w:eastAsia="Calibri" w:hAnsi="Calibri"/>
         </w:rPr>
         <w:t xml:space="preserve">Entwurf — noch nicht mit Alexander abgestimmt:</w:t>
-      </w:r>
-    </w:p>
-    <w:p>
-      <w:pPr>
-        <w:pStyle w:val="ListParagraph"/>
-        <w:numPr>
-          <w:ilvl w:val="0"/>
-          <w:numId w:val="2"/>
-        </w:numPr>
-        <w:spacing w:after="80"/>
-        <w:jc w:val="both"/>
-      </w:pPr>
-      <w:r>
-        <w:rPr>
-          <w:rFonts w:ascii="Calibri" w:cs="Calibri" w:eastAsia="Calibri" w:hAnsi="Calibri"/>
-        </w:rPr>
-        <w:t xml:space="preserve">Abgeschlossene kaufmännische oder technische Ausbildung mit Bezug zu Personal-/Organisationsthemen (z. B. HR, Betriebswirtschaft, Produktionstechnik mit Personalverantwortung)</w:t>
       </w:r>
     </w:p>
     <w:p>

</xml_diff>

<commit_message>
Produktionskoordination-Stellenbeschreibung: internen Prozess-Hinweis entfernt
"Entwurf — noch nicht mit Alexander abgestimmt:" war als sichtbarer Satz im
Dokumentinhalt stehen geblieben (Codekommentar mit derselben Aussage ebenso
entfernt). Gleicher Grundsatz wie beim Markup-Review des Hauptdokuments:
ein Stellenbeschreibungs-Entwurf transportiert Inhalt, keine internen
Abstimmungs-/Prozessnotizen.

Co-Authored-By: Claude Sonnet 5 <noreply@anthropic.com>
Claude-Session: https://claude.ai/code/session_01DYu9Jmx4EF5jDapuJDs8ut
</commit_message>
<xml_diff>
--- a/working/PRODUKTIONSKOORDINATION_Stellenbeschreibung_Arbeitsentwurf.docx
+++ b/working/PRODUKTIONSKOORDINATION_Stellenbeschreibung_Arbeitsentwurf.docx
@@ -318,18 +318,6 @@
           <w:bCs/>
         </w:rPr>
         <w:t xml:space="preserve">Erforderliche Qualifikationen</w:t>
-      </w:r>
-    </w:p>
-    <w:p>
-      <w:pPr>
-        <w:spacing w:after="120"/>
-        <w:jc w:val="both"/>
-      </w:pPr>
-      <w:r>
-        <w:rPr>
-          <w:rFonts w:ascii="Calibri" w:cs="Calibri" w:eastAsia="Calibri" w:hAnsi="Calibri"/>
-        </w:rPr>
-        <w:t xml:space="preserve">Entwurf — noch nicht mit Alexander abgestimmt:</w:t>
       </w:r>
     </w:p>
     <w:p>

</xml_diff>

<commit_message>
Produktionskoordination: Themenblock 3 (Abgrenzung zu Planung/Linienfunktionen) + Aufgaben ergänzt
Aus der standortübergreifenden Klärung der Rolle (Pfarrkirchen/Losenstein,
gleiche Stellenbeschreibung an beiden Standorten gültig). Generalisiert,
ohne Namensnennung der Stelleninhaberinnen.

Neu in Aufgaben: Schulungsdurchführung bei fehlender Qualifikation,
Beobachtung/Nachverfolgung von Personalzykluszeit-Abweichungen,
Sicherstellen ergänzter Prozessdokumentation.

Neu in Grundsätzliches/Themenblock 3: explizite Abgrenzung — Planung und
kurzfristige Plankorrektur sowie Verfügbarkeit von Material/Maschinen/
Dokumenten/Informationen sind NICHT Teil dieser Funktion (Planung bzw.
Linienfunktionen); laufende Optimierung im eigenen Bereich obliegt der
jeweiligen Führungskraft selbst (Prozesseigner-Prinzip).

Co-Authored-By: Claude Sonnet 5 <noreply@anthropic.com>
Claude-Session: https://claude.ai/code/session_01DYu9Jmx4EF5jDapuJDs8ut
</commit_message>
<xml_diff>
--- a/working/PRODUKTIONSKOORDINATION_Stellenbeschreibung_Arbeitsentwurf.docx
+++ b/working/PRODUKTIONSKOORDINATION_Stellenbeschreibung_Arbeitsentwurf.docx
@@ -161,6 +161,40 @@
     </w:p>
     <w:p>
       <w:pPr>
+        <w:pStyle w:val="ListParagraph"/>
+        <w:numPr>
+          <w:ilvl w:val="0"/>
+          <w:numId w:val="2"/>
+        </w:numPr>
+        <w:spacing w:after="80"/>
+        <w:jc w:val="both"/>
+      </w:pPr>
+      <w:r>
+        <w:rPr>
+          <w:rFonts w:ascii="Calibri" w:cs="Calibri" w:eastAsia="Calibri" w:hAnsi="Calibri"/>
+        </w:rPr>
+        <w:t xml:space="preserve">Planung und kurzfristige Korrektur der Planung bei betrieblichen Abweichungen ist nicht Teil dieser Funktion — das obliegt der Produktionsplanung und -steuerung</w:t>
+      </w:r>
+    </w:p>
+    <w:p>
+      <w:pPr>
+        <w:pStyle w:val="ListParagraph"/>
+        <w:numPr>
+          <w:ilvl w:val="0"/>
+          <w:numId w:val="2"/>
+        </w:numPr>
+        <w:spacing w:after="80"/>
+        <w:jc w:val="both"/>
+      </w:pPr>
+      <w:r>
+        <w:rPr>
+          <w:rFonts w:ascii="Calibri" w:cs="Calibri" w:eastAsia="Calibri" w:hAnsi="Calibri"/>
+        </w:rPr>
+        <w:t xml:space="preserve">Sicherstellen der Verfügbarkeit von Material, Maschinen, Dokumenten und Informationen am Arbeitsplatz ist nicht Teil dieser Funktion — das liegt bei den jeweiligen Linienfunktionen</w:t>
+      </w:r>
+    </w:p>
+    <w:p>
+      <w:pPr>
         <w:pStyle w:val="Heading2"/>
         <w:spacing w:after="160" w:before="280"/>
       </w:pPr>
@@ -238,7 +272,58 @@
         <w:rPr>
           <w:rFonts w:ascii="Calibri" w:cs="Calibri" w:eastAsia="Calibri" w:hAnsi="Calibri"/>
         </w:rPr>
+        <w:t xml:space="preserve">Organisation bzw. eigenständige Durchführung von Schulungen bei fehlender Qualifikation</w:t>
+      </w:r>
+    </w:p>
+    <w:p>
+      <w:pPr>
+        <w:pStyle w:val="ListParagraph"/>
+        <w:numPr>
+          <w:ilvl w:val="0"/>
+          <w:numId w:val="2"/>
+        </w:numPr>
+        <w:spacing w:after="80"/>
+        <w:jc w:val="both"/>
+      </w:pPr>
+      <w:r>
+        <w:rPr>
+          <w:rFonts w:ascii="Calibri" w:cs="Calibri" w:eastAsia="Calibri" w:hAnsi="Calibri"/>
+        </w:rPr>
         <w:t xml:space="preserve">Konzeptionelle Erarbeitung von Arbeitszeitmodellen (z. B. zur Flexibilisierung und Effizienzsteigerung)</w:t>
+      </w:r>
+    </w:p>
+    <w:p>
+      <w:pPr>
+        <w:pStyle w:val="ListParagraph"/>
+        <w:numPr>
+          <w:ilvl w:val="0"/>
+          <w:numId w:val="2"/>
+        </w:numPr>
+        <w:spacing w:after="80"/>
+        <w:jc w:val="both"/>
+      </w:pPr>
+      <w:r>
+        <w:rPr>
+          <w:rFonts w:ascii="Calibri" w:cs="Calibri" w:eastAsia="Calibri" w:hAnsi="Calibri"/>
+        </w:rPr>
+        <w:t xml:space="preserve">Beobachtung und Nachverfolgung von Abweichungen bei Personalzykluszeiten (Datenauswertung)</w:t>
+      </w:r>
+    </w:p>
+    <w:p>
+      <w:pPr>
+        <w:pStyle w:val="ListParagraph"/>
+        <w:numPr>
+          <w:ilvl w:val="0"/>
+          <w:numId w:val="2"/>
+        </w:numPr>
+        <w:spacing w:after="80"/>
+        <w:jc w:val="both"/>
+      </w:pPr>
+      <w:r>
+        <w:rPr>
+          <w:rFonts w:ascii="Calibri" w:cs="Calibri" w:eastAsia="Calibri" w:hAnsi="Calibri"/>
+        </w:rPr>
+        <w:t xml:space="preserve">Sicherstellen, dass fehlende Prozessdokumentation ergänzt wird</w:t>
       </w:r>
     </w:p>
     <w:p>

</xml_diff>

<commit_message>
Produktionskoordination: Urlaubsplanung in der Aufgabenliste nach hinten gereiht
Jetzt Position 5 statt 1 - weniger prominent positioniert.

Co-Authored-By: Claude Sonnet 5 <noreply@anthropic.com>
Claude-Session: https://claude.ai/code/session_01DYu9Jmx4EF5jDapuJDs8ut
</commit_message>
<xml_diff>
--- a/working/PRODUKTIONSKOORDINATION_Stellenbeschreibung_Arbeitsentwurf.docx
+++ b/working/PRODUKTIONSKOORDINATION_Stellenbeschreibung_Arbeitsentwurf.docx
@@ -221,75 +221,75 @@
         <w:rPr>
           <w:rFonts w:ascii="Calibri" w:cs="Calibri" w:eastAsia="Calibri" w:hAnsi="Calibri"/>
         </w:rPr>
+        <w:t xml:space="preserve">Mitwirkung bei der Personalauswahl und -entwicklung</w:t>
+      </w:r>
+    </w:p>
+    <w:p>
+      <w:pPr>
+        <w:pStyle w:val="ListParagraph"/>
+        <w:numPr>
+          <w:ilvl w:val="0"/>
+          <w:numId w:val="2"/>
+        </w:numPr>
+        <w:spacing w:after="80"/>
+        <w:jc w:val="both"/>
+      </w:pPr>
+      <w:r>
+        <w:rPr>
+          <w:rFonts w:ascii="Calibri" w:cs="Calibri" w:eastAsia="Calibri" w:hAnsi="Calibri"/>
+        </w:rPr>
+        <w:t xml:space="preserve">Erstellung von Schulungsprogrammen und Qualifizierungsunterlagen im Lernmanagementsystem (LMS)</w:t>
+      </w:r>
+    </w:p>
+    <w:p>
+      <w:pPr>
+        <w:pStyle w:val="ListParagraph"/>
+        <w:numPr>
+          <w:ilvl w:val="0"/>
+          <w:numId w:val="2"/>
+        </w:numPr>
+        <w:spacing w:after="80"/>
+        <w:jc w:val="both"/>
+      </w:pPr>
+      <w:r>
+        <w:rPr>
+          <w:rFonts w:ascii="Calibri" w:cs="Calibri" w:eastAsia="Calibri" w:hAnsi="Calibri"/>
+        </w:rPr>
+        <w:t xml:space="preserve">Organisation bzw. eigenständige Durchführung von Schulungen bei fehlender Qualifikation</w:t>
+      </w:r>
+    </w:p>
+    <w:p>
+      <w:pPr>
+        <w:pStyle w:val="ListParagraph"/>
+        <w:numPr>
+          <w:ilvl w:val="0"/>
+          <w:numId w:val="2"/>
+        </w:numPr>
+        <w:spacing w:after="80"/>
+        <w:jc w:val="both"/>
+      </w:pPr>
+      <w:r>
+        <w:rPr>
+          <w:rFonts w:ascii="Calibri" w:cs="Calibri" w:eastAsia="Calibri" w:hAnsi="Calibri"/>
+        </w:rPr>
+        <w:t xml:space="preserve">Konzeptionelle Erarbeitung von Arbeitszeitmodellen (z. B. zur Flexibilisierung und Effizienzsteigerung)</w:t>
+      </w:r>
+    </w:p>
+    <w:p>
+      <w:pPr>
+        <w:pStyle w:val="ListParagraph"/>
+        <w:numPr>
+          <w:ilvl w:val="0"/>
+          <w:numId w:val="2"/>
+        </w:numPr>
+        <w:spacing w:after="80"/>
+        <w:jc w:val="both"/>
+      </w:pPr>
+      <w:r>
+        <w:rPr>
+          <w:rFonts w:ascii="Calibri" w:cs="Calibri" w:eastAsia="Calibri" w:hAnsi="Calibri"/>
+        </w:rPr>
         <w:t xml:space="preserve">Urlaubsplanung (Abwesenheitsübersicht im digitalen Arbeitsplatz-Portal „Kienformation-Center“)</w:t>
-      </w:r>
-    </w:p>
-    <w:p>
-      <w:pPr>
-        <w:pStyle w:val="ListParagraph"/>
-        <w:numPr>
-          <w:ilvl w:val="0"/>
-          <w:numId w:val="2"/>
-        </w:numPr>
-        <w:spacing w:after="80"/>
-        <w:jc w:val="both"/>
-      </w:pPr>
-      <w:r>
-        <w:rPr>
-          <w:rFonts w:ascii="Calibri" w:cs="Calibri" w:eastAsia="Calibri" w:hAnsi="Calibri"/>
-        </w:rPr>
-        <w:t xml:space="preserve">Mitwirkung bei der Personalauswahl und -entwicklung</w:t>
-      </w:r>
-    </w:p>
-    <w:p>
-      <w:pPr>
-        <w:pStyle w:val="ListParagraph"/>
-        <w:numPr>
-          <w:ilvl w:val="0"/>
-          <w:numId w:val="2"/>
-        </w:numPr>
-        <w:spacing w:after="80"/>
-        <w:jc w:val="both"/>
-      </w:pPr>
-      <w:r>
-        <w:rPr>
-          <w:rFonts w:ascii="Calibri" w:cs="Calibri" w:eastAsia="Calibri" w:hAnsi="Calibri"/>
-        </w:rPr>
-        <w:t xml:space="preserve">Erstellung von Schulungsprogrammen und Qualifizierungsunterlagen im Lernmanagementsystem (LMS)</w:t>
-      </w:r>
-    </w:p>
-    <w:p>
-      <w:pPr>
-        <w:pStyle w:val="ListParagraph"/>
-        <w:numPr>
-          <w:ilvl w:val="0"/>
-          <w:numId w:val="2"/>
-        </w:numPr>
-        <w:spacing w:after="80"/>
-        <w:jc w:val="both"/>
-      </w:pPr>
-      <w:r>
-        <w:rPr>
-          <w:rFonts w:ascii="Calibri" w:cs="Calibri" w:eastAsia="Calibri" w:hAnsi="Calibri"/>
-        </w:rPr>
-        <w:t xml:space="preserve">Organisation bzw. eigenständige Durchführung von Schulungen bei fehlender Qualifikation</w:t>
-      </w:r>
-    </w:p>
-    <w:p>
-      <w:pPr>
-        <w:pStyle w:val="ListParagraph"/>
-        <w:numPr>
-          <w:ilvl w:val="0"/>
-          <w:numId w:val="2"/>
-        </w:numPr>
-        <w:spacing w:after="80"/>
-        <w:jc w:val="both"/>
-      </w:pPr>
-      <w:r>
-        <w:rPr>
-          <w:rFonts w:ascii="Calibri" w:cs="Calibri" w:eastAsia="Calibri" w:hAnsi="Calibri"/>
-        </w:rPr>
-        <w:t xml:space="preserve">Konzeptionelle Erarbeitung von Arbeitszeitmodellen (z. B. zur Flexibilisierung und Effizienzsteigerung)</w:t>
       </w:r>
     </w:p>
     <w:p>

</xml_diff>

<commit_message>
Produktionskoordination: Aufgaben nach Priorität Prävention/Optimierung sortiert
Qualifizierung, Zykluszeit-Monitoring, Prozessdokumentation und
Optimierungsprojekte jetzt vor den administrativen/organisatorischen
Aufgaben (Personalauswahl, Arbeitszeitmodelle, Urlaubsplanung).

Co-Authored-By: Claude Sonnet 5 <noreply@anthropic.com>
Claude-Session: https://claude.ai/code/session_01DYu9Jmx4EF5jDapuJDs8ut
</commit_message>
<xml_diff>
--- a/working/PRODUKTIONSKOORDINATION_Stellenbeschreibung_Arbeitsentwurf.docx
+++ b/working/PRODUKTIONSKOORDINATION_Stellenbeschreibung_Arbeitsentwurf.docx
@@ -221,6 +221,91 @@
         <w:rPr>
           <w:rFonts w:ascii="Calibri" w:cs="Calibri" w:eastAsia="Calibri" w:hAnsi="Calibri"/>
         </w:rPr>
+        <w:t xml:space="preserve">Erstellung von Schulungsprogrammen und Qualifizierungsunterlagen im Lernmanagementsystem (LMS)</w:t>
+      </w:r>
+    </w:p>
+    <w:p>
+      <w:pPr>
+        <w:pStyle w:val="ListParagraph"/>
+        <w:numPr>
+          <w:ilvl w:val="0"/>
+          <w:numId w:val="2"/>
+        </w:numPr>
+        <w:spacing w:after="80"/>
+        <w:jc w:val="both"/>
+      </w:pPr>
+      <w:r>
+        <w:rPr>
+          <w:rFonts w:ascii="Calibri" w:cs="Calibri" w:eastAsia="Calibri" w:hAnsi="Calibri"/>
+        </w:rPr>
+        <w:t xml:space="preserve">Organisation bzw. eigenständige Durchführung von Schulungen bei fehlender Qualifikation</w:t>
+      </w:r>
+    </w:p>
+    <w:p>
+      <w:pPr>
+        <w:pStyle w:val="ListParagraph"/>
+        <w:numPr>
+          <w:ilvl w:val="0"/>
+          <w:numId w:val="2"/>
+        </w:numPr>
+        <w:spacing w:after="80"/>
+        <w:jc w:val="both"/>
+      </w:pPr>
+      <w:r>
+        <w:rPr>
+          <w:rFonts w:ascii="Calibri" w:cs="Calibri" w:eastAsia="Calibri" w:hAnsi="Calibri"/>
+        </w:rPr>
+        <w:t xml:space="preserve">Beobachtung und Nachverfolgung von Abweichungen bei Personalzykluszeiten (Datenauswertung)</w:t>
+      </w:r>
+    </w:p>
+    <w:p>
+      <w:pPr>
+        <w:pStyle w:val="ListParagraph"/>
+        <w:numPr>
+          <w:ilvl w:val="0"/>
+          <w:numId w:val="2"/>
+        </w:numPr>
+        <w:spacing w:after="80"/>
+        <w:jc w:val="both"/>
+      </w:pPr>
+      <w:r>
+        <w:rPr>
+          <w:rFonts w:ascii="Calibri" w:cs="Calibri" w:eastAsia="Calibri" w:hAnsi="Calibri"/>
+        </w:rPr>
+        <w:t xml:space="preserve">Sicherstellen, dass fehlende Prozessdokumentation ergänzt wird</w:t>
+      </w:r>
+    </w:p>
+    <w:p>
+      <w:pPr>
+        <w:pStyle w:val="ListParagraph"/>
+        <w:numPr>
+          <w:ilvl w:val="0"/>
+          <w:numId w:val="2"/>
+        </w:numPr>
+        <w:spacing w:after="80"/>
+        <w:jc w:val="both"/>
+      </w:pPr>
+      <w:r>
+        <w:rPr>
+          <w:rFonts w:ascii="Calibri" w:cs="Calibri" w:eastAsia="Calibri" w:hAnsi="Calibri"/>
+        </w:rPr>
+        <w:t xml:space="preserve">Mitwirkung bei anlassbezogenen Problemlösungs-/Optimierungsprojekten, insbesondere bei Themen mit Ursache „Mensch“ (Abgrenzung zu Maschine/Material/Methode) — z. B. Nichteinhaltung von Zykluszeiten (Effizienz) oder Abweichungen aufgrund von Können/Wollen/Disziplin (Qualität)</w:t>
+      </w:r>
+    </w:p>
+    <w:p>
+      <w:pPr>
+        <w:pStyle w:val="ListParagraph"/>
+        <w:numPr>
+          <w:ilvl w:val="0"/>
+          <w:numId w:val="2"/>
+        </w:numPr>
+        <w:spacing w:after="80"/>
+        <w:jc w:val="both"/>
+      </w:pPr>
+      <w:r>
+        <w:rPr>
+          <w:rFonts w:ascii="Calibri" w:cs="Calibri" w:eastAsia="Calibri" w:hAnsi="Calibri"/>
+        </w:rPr>
         <w:t xml:space="preserve">Mitwirkung bei der Personalauswahl und -entwicklung</w:t>
       </w:r>
     </w:p>
@@ -238,40 +323,6 @@
         <w:rPr>
           <w:rFonts w:ascii="Calibri" w:cs="Calibri" w:eastAsia="Calibri" w:hAnsi="Calibri"/>
         </w:rPr>
-        <w:t xml:space="preserve">Erstellung von Schulungsprogrammen und Qualifizierungsunterlagen im Lernmanagementsystem (LMS)</w:t>
-      </w:r>
-    </w:p>
-    <w:p>
-      <w:pPr>
-        <w:pStyle w:val="ListParagraph"/>
-        <w:numPr>
-          <w:ilvl w:val="0"/>
-          <w:numId w:val="2"/>
-        </w:numPr>
-        <w:spacing w:after="80"/>
-        <w:jc w:val="both"/>
-      </w:pPr>
-      <w:r>
-        <w:rPr>
-          <w:rFonts w:ascii="Calibri" w:cs="Calibri" w:eastAsia="Calibri" w:hAnsi="Calibri"/>
-        </w:rPr>
-        <w:t xml:space="preserve">Organisation bzw. eigenständige Durchführung von Schulungen bei fehlender Qualifikation</w:t>
-      </w:r>
-    </w:p>
-    <w:p>
-      <w:pPr>
-        <w:pStyle w:val="ListParagraph"/>
-        <w:numPr>
-          <w:ilvl w:val="0"/>
-          <w:numId w:val="2"/>
-        </w:numPr>
-        <w:spacing w:after="80"/>
-        <w:jc w:val="both"/>
-      </w:pPr>
-      <w:r>
-        <w:rPr>
-          <w:rFonts w:ascii="Calibri" w:cs="Calibri" w:eastAsia="Calibri" w:hAnsi="Calibri"/>
-        </w:rPr>
         <w:t xml:space="preserve">Konzeptionelle Erarbeitung von Arbeitszeitmodellen (z. B. zur Flexibilisierung und Effizienzsteigerung)</w:t>
       </w:r>
     </w:p>
@@ -290,57 +341,6 @@
           <w:rFonts w:ascii="Calibri" w:cs="Calibri" w:eastAsia="Calibri" w:hAnsi="Calibri"/>
         </w:rPr>
         <w:t xml:space="preserve">Urlaubsplanung (Abwesenheitsübersicht im digitalen Arbeitsplatz-Portal „Kienformation-Center“)</w:t>
-      </w:r>
-    </w:p>
-    <w:p>
-      <w:pPr>
-        <w:pStyle w:val="ListParagraph"/>
-        <w:numPr>
-          <w:ilvl w:val="0"/>
-          <w:numId w:val="2"/>
-        </w:numPr>
-        <w:spacing w:after="80"/>
-        <w:jc w:val="both"/>
-      </w:pPr>
-      <w:r>
-        <w:rPr>
-          <w:rFonts w:ascii="Calibri" w:cs="Calibri" w:eastAsia="Calibri" w:hAnsi="Calibri"/>
-        </w:rPr>
-        <w:t xml:space="preserve">Beobachtung und Nachverfolgung von Abweichungen bei Personalzykluszeiten (Datenauswertung)</w:t>
-      </w:r>
-    </w:p>
-    <w:p>
-      <w:pPr>
-        <w:pStyle w:val="ListParagraph"/>
-        <w:numPr>
-          <w:ilvl w:val="0"/>
-          <w:numId w:val="2"/>
-        </w:numPr>
-        <w:spacing w:after="80"/>
-        <w:jc w:val="both"/>
-      </w:pPr>
-      <w:r>
-        <w:rPr>
-          <w:rFonts w:ascii="Calibri" w:cs="Calibri" w:eastAsia="Calibri" w:hAnsi="Calibri"/>
-        </w:rPr>
-        <w:t xml:space="preserve">Sicherstellen, dass fehlende Prozessdokumentation ergänzt wird</w:t>
-      </w:r>
-    </w:p>
-    <w:p>
-      <w:pPr>
-        <w:pStyle w:val="ListParagraph"/>
-        <w:numPr>
-          <w:ilvl w:val="0"/>
-          <w:numId w:val="2"/>
-        </w:numPr>
-        <w:spacing w:after="80"/>
-        <w:jc w:val="both"/>
-      </w:pPr>
-      <w:r>
-        <w:rPr>
-          <w:rFonts w:ascii="Calibri" w:cs="Calibri" w:eastAsia="Calibri" w:hAnsi="Calibri"/>
-        </w:rPr>
-        <w:t xml:space="preserve">Mitwirkung bei anlassbezogenen Problemlösungs-/Optimierungsprojekten, insbesondere bei Themen mit Ursache „Mensch“ (Abgrenzung zu Maschine/Material/Methode) — z. B. Nichteinhaltung von Zykluszeiten (Effizienz) oder Abweichungen aufgrund von Können/Wollen/Disziplin (Qualität)</w:t>
       </w:r>
     </w:p>
     <w:p>

</xml_diff>

<commit_message>
Produktionskoordination: Hinweis ergänzt, dass dies ein Teilaufgabenbereich ist
Am Dokumentanfang und in notes/PRODUKTIONSKOORDINATION.md klargestellt:
Diese Stellenbeschreibung bildet keine vollständige Funktion (1 Person) ab,
sondern einen Teilaufgaben-/Verantwortungsbereich, der in der Praxis durch
weitere Bereiche ergänzt wird (z. B. QS, operative Teamleitung) - konkret
in Pfarrkirchen Teamleitung Endfertigung, in Losenstein QS.

Co-Authored-By: Claude Sonnet 5 <noreply@anthropic.com>
Claude-Session: https://claude.ai/code/session_01DYu9Jmx4EF5jDapuJDs8ut
</commit_message>
<xml_diff>
--- a/working/PRODUKTIONSKOORDINATION_Stellenbeschreibung_Arbeitsentwurf.docx
+++ b/working/PRODUKTIONSKOORDINATION_Stellenbeschreibung_Arbeitsentwurf.docx
@@ -16,7 +16,7 @@
     </w:p>
     <w:p>
       <w:pPr>
-        <w:spacing w:after="200"/>
+        <w:spacing w:after="160"/>
       </w:pPr>
       <w:r>
         <w:rPr>
@@ -27,6 +27,22 @@
           <w:szCs w:val="18"/>
         </w:rPr>
         <w:t xml:space="preserve">Arbeitsentwurf.</w:t>
+      </w:r>
+    </w:p>
+    <w:p>
+      <w:pPr>
+        <w:spacing w:after="200"/>
+        <w:jc w:val="both"/>
+      </w:pPr>
+      <w:r>
+        <w:rPr>
+          <w:rFonts w:ascii="Calibri" w:cs="Calibri" w:eastAsia="Calibri" w:hAnsi="Calibri"/>
+          <w:b/>
+          <w:bCs/>
+          <w:sz w:val="20"/>
+          <w:szCs w:val="20"/>
+        </w:rPr>
+        <w:t xml:space="preserve">Diese Stellenbeschreibung bildet keine vollständige Funktion (1 Person) ab, sondern einen Teilaufgaben-/Verantwortungsbereich. Sie wird in der Praxis durch weitere Aufgaben-/Verantwortungsbereiche ergänzt (z. B. QS, operative Teamleitung).</w:t>
       </w:r>
     </w:p>
     <w:p>

</xml_diff>

<commit_message>
Produktionskoordination/QS-Stellenbeschreibung: "Arbeitsentwurf."-Zeile entfernt, PDFs für Ari ergänzt
Entwurfsstatus steht weiterhin über den Dateinamen ("..._Arbeitsentwurf"),
nicht mehr als Textzeile im Dokument. PDF-Export beider Dokumente zum
Download/Weitergeben an Ari hinzugefügt.

Co-Authored-By: Claude Sonnet 5 <noreply@anthropic.com>
Claude-Session: https://claude.ai/code/session_01DYu9Jmx4EF5jDapuJDs8ut
</commit_message>
<xml_diff>
--- a/working/PRODUKTIONSKOORDINATION_Stellenbeschreibung_Arbeitsentwurf.docx
+++ b/working/PRODUKTIONSKOORDINATION_Stellenbeschreibung_Arbeitsentwurf.docx
@@ -12,21 +12,6 @@
           <w:szCs w:val="28"/>
         </w:rPr>
         <w:t xml:space="preserve">Stellenbeschreibung: Produktionskoordination (Organisation/Personal)</w:t>
-      </w:r>
-    </w:p>
-    <w:p>
-      <w:pPr>
-        <w:spacing w:after="160"/>
-      </w:pPr>
-      <w:r>
-        <w:rPr>
-          <w:rFonts w:ascii="Calibri" w:cs="Calibri" w:eastAsia="Calibri" w:hAnsi="Calibri"/>
-          <w:i/>
-          <w:iCs/>
-          <w:sz w:val="18"/>
-          <w:szCs w:val="18"/>
-        </w:rPr>
-        <w:t xml:space="preserve">Arbeitsentwurf.</w:t>
       </w:r>
     </w:p>
     <w:p>

</xml_diff>